<commit_message>
Work With Me page deployed to staging as a new page, WP deploy mechanics (theme-override + button-fix CSS, HTML-comment-stripping gotcha) discovered and documented; Brooke Billingsley client quote mocked up and added between the two tracks, quote marks removed on request; draft-email style check compared Gmail inbox-reply drafts (HubSpot Active Engagers found unchanged) and logged new voice patterns to memory; Day B strength session and hill warmup logged after resolving voice-dictation ambiguities with Jackie directly
</commit_message>
<xml_diff>
--- a/outputs/website-redesign/2026-08-12-work-with-me-copy.docx
+++ b/outputs/website-redesign/2026-08-12-work-with-me-copy.docx
@@ -11,7 +11,7 @@
           <w:b/>
           <w:bCs/>
         </w:rPr>
-        <w:t xml:space="preserve">Work With Me — Page Copy (2026-08-12, revision 8 — current)</w:t>
+        <w:t xml:space="preserve">Work With Me — Page Copy (2026-08-13, revision 11 — current)</w:t>
       </w:r>
     </w:p>
     <w:p>
@@ -203,7 +203,7 @@
         <w:spacing w:after="200"/>
       </w:pPr>
       <w:r>
-        <w:t xml:space="preserve">Schedule a single session. No ongoing commitment. You bring the issue. We work it until you leave with an actual next step.</w:t>
+        <w:t xml:space="preserve">Schedule a single session with no ongoing commitment. You bring the issue. We work through it and you leave with an achievable next step.</w:t>
       </w:r>
     </w:p>
     <w:p>
@@ -244,15 +244,15 @@
         <w:spacing w:after="200"/>
       </w:pPr>
       <w:r>
-        <w:t xml:space="preserve">Not sure which one fits, or whether I'm the right person for the job? That's exactly what the first conversation is for. I want to understand what's actually going on in your business, confirm I can be of real value, and make sure it feels like the right fit on both sides.</w:t>
-      </w:r>
-    </w:p>
-    <w:p>
-      <w:pPr>
-        <w:spacing w:after="200"/>
-      </w:pPr>
-      <w:r>
-        <w:t xml:space="preserve">I deliberately work with a small number of clients at a time, so every client gets my full attention. I read every message myself and reply personally, usually within a day or two.</w:t>
+        <w:t xml:space="preserve">Not sure which one fits, or whether I'm the right person for the job? That's exactly what the first conversation is for. I want to understand what's actually going on in your business, confirm I can be of real value, and make sure it feels like the right fit for both of us.</w:t>
+      </w:r>
+    </w:p>
+    <w:p>
+      <w:pPr>
+        <w:spacing w:after="200"/>
+      </w:pPr>
+      <w:r>
+        <w:t xml:space="preserve">I deliberately work with a small number of clients so every client gets my full attention. I read every message myself and usually reply within a day or two.</w:t>
       </w:r>
     </w:p>
     <w:p>
@@ -382,6 +382,30 @@
       </w:pPr>
       <w:r>
         <w:t xml:space="preserve">Revision 8 (2026-08-12): cut "The program comes after, based on what you need, not before" from the end of the same paragraph. It still presupposed a program was the outcome, just avoided saying which one before the call — a milder version of the same assumption already corrected earlier. The paragraph now ends on "make sure it feels like the right fit on both sides," which doesn't presuppose any particular outcome, including no program at all, just this one conversation.</w:t>
+      </w:r>
+    </w:p>
+    <w:p>
+      <w:pPr>
+        <w:spacing w:after="200"/>
+      </w:pPr>
+      <w:r>
+        <w:t xml:space="preserve">Revision 9 (2026-08-13): AI-cadence scrub pass, per Jackie's direct flag. "On both sides" changed to "for both of us." Removed comma-joined connector clauses in the closing paragraph ("at a time, so every client" and "reply personally, usually within a day or two") flagged as reading like AI. Also fixed a live violation of the no-3-similar-length-sentences-in-a-row rule in Solutions on the Fly's closing paragraph, combined into two sentences with natural connectors.</w:t>
+      </w:r>
+    </w:p>
+    <w:p>
+      <w:pPr>
+        <w:spacing w:after="200"/>
+      </w:pPr>
+      <w:r>
+        <w:t xml:space="preserve">Revision 10 (2026-08-13): Jackie asked for the commas eliminated from the Revision 9 fix on Solutions on the Fly's closing line too. Changed to three short, unevenly-lengthed comma-free sentences instead of two comma-joined ones.</w:t>
+      </w:r>
+    </w:p>
+    <w:p>
+      <w:pPr>
+        <w:spacing w:after="200"/>
+      </w:pPr>
+      <w:r>
+        <w:t xml:space="preserve">Revision 11 (2026-08-13): two more word-level fixes — "an actual next step" changed to "an achievable next step," and "a small number of clients at a time" changed to "a small number of clients" ("at a time" cut as unnecessary).</w:t>
       </w:r>
     </w:p>
     <w:sectPr>

</xml_diff>